<commit_message>
Update SOP template: 2-col header, BM logo, drop Division/Owner, clean title
Header is now left (NC logo) / right (BM logo). Metadata table removed
Division and Owner fields. Title no longer prefixes SOP number. BM logo
added to Images/. NC logo placeholder ready for Images/NC logo.png.

Co-Authored-By: Claude Sonnet 4.6 <noreply@anthropic.com>
</commit_message>
<xml_diff>
--- a/Standard Operating Procedures/Tr3 Statement of Intent.docx
+++ b/Standard Operating Procedures/Tr3 Statement of Intent.docx
@@ -9,14 +9,13 @@
         <w:tblLook w:firstColumn="1" w:firstRow="1" w:lastColumn="0" w:lastRow="0" w:noHBand="0" w:noVBand="1" w:val="04A0"/>
       </w:tblPr>
       <w:tblGrid>
-        <w:gridCol w:w="2592"/>
-        <w:gridCol w:w="4320"/>
-        <w:gridCol w:w="2592"/>
+        <w:gridCol w:w="4680"/>
+        <w:gridCol w:w="4680"/>
       </w:tblGrid>
       <w:tr>
         <w:tc>
           <w:tcPr>
-            <w:tcW w:type="dxa" w:w="3120"/>
+            <w:tcW w:type="dxa" w:w="4680"/>
             <w:vAlign w:val="center"/>
             <w:tcBorders>
               <w:top w:val="none"/>
@@ -30,71 +29,18 @@
               <w:jc w:val="left"/>
             </w:pPr>
             <w:r>
-              <w:drawing>
-                <wp:inline xmlns:a="http://schemas.openxmlformats.org/drawingml/2006/main" xmlns:pic="http://schemas.openxmlformats.org/drawingml/2006/picture">
-                  <wp:extent cx="1371600" cy="822960"/>
-                  <wp:docPr id="1" name="Picture 1"/>
-                  <wp:cNvGraphicFramePr>
-                    <a:graphicFrameLocks noChangeAspect="1"/>
-                  </wp:cNvGraphicFramePr>
-                  <a:graphic>
-                    <a:graphicData uri="http://schemas.openxmlformats.org/drawingml/2006/picture">
-                      <pic:pic>
-                        <pic:nvPicPr>
-                          <pic:cNvPr id="0" name="Nipple Crime Flag.png"/>
-                          <pic:cNvPicPr/>
-                        </pic:nvPicPr>
-                        <pic:blipFill>
-                          <a:blip r:embed="rId9"/>
-                          <a:stretch>
-                            <a:fillRect/>
-                          </a:stretch>
-                        </pic:blipFill>
-                        <pic:spPr>
-                          <a:xfrm>
-                            <a:off x="0" y="0"/>
-                            <a:ext cx="1371600" cy="822960"/>
-                          </a:xfrm>
-                          <a:prstGeom prst="rect"/>
-                        </pic:spPr>
-                      </pic:pic>
-                    </a:graphicData>
-                  </a:graphic>
-                </wp:inline>
-              </w:drawing>
+              <w:rPr>
+                <w:b/>
+                <w:i w:val="0"/>
+                <w:sz w:val="28"/>
+              </w:rPr>
+              <w:t>NIPPLE CRIME</w:t>
             </w:r>
           </w:p>
         </w:tc>
         <w:tc>
           <w:tcPr>
-            <w:tcW w:type="dxa" w:w="3120"/>
-            <w:vAlign w:val="center"/>
-            <w:tcBorders>
-              <w:top w:val="none"/>
-              <w:left w:val="none"/>
-              <w:bottom w:val="none"/>
-              <w:right w:val="none"/>
-            </w:tcBorders>
-          </w:tcPr>
-          <w:p>
-            <w:pPr>
-              <w:jc w:val="center"/>
-            </w:pPr>
-            <w:r>
-              <w:rPr>
-                <w:b/>
-                <w:i w:val="0"/>
-                <w:sz w:val="28"/>
-              </w:rPr>
-              <w:t>Nipple Crime</w:t>
-              <w:br/>
-              <w:t>Theme Camp</w:t>
-            </w:r>
-          </w:p>
-        </w:tc>
-        <w:tc>
-          <w:tcPr>
-            <w:tcW w:type="dxa" w:w="3120"/>
+            <w:tcW w:type="dxa" w:w="4680"/>
             <w:vAlign w:val="center"/>
             <w:tcBorders>
               <w:top w:val="none"/>
@@ -108,10 +54,38 @@
               <w:jc w:val="right"/>
             </w:pPr>
             <w:r>
-              <w:rPr>
-                <w:b/>
-              </w:rPr>
-              <w:t>[Burning Man Logo]</w:t>
+              <w:drawing>
+                <wp:inline xmlns:a="http://schemas.openxmlformats.org/drawingml/2006/main" xmlns:pic="http://schemas.openxmlformats.org/drawingml/2006/picture">
+                  <wp:extent cx="1376275" cy="914400"/>
+                  <wp:docPr id="1" name="Picture 1"/>
+                  <wp:cNvGraphicFramePr>
+                    <a:graphicFrameLocks noChangeAspect="1"/>
+                  </wp:cNvGraphicFramePr>
+                  <a:graphic>
+                    <a:graphicData uri="http://schemas.openxmlformats.org/drawingml/2006/picture">
+                      <pic:pic>
+                        <pic:nvPicPr>
+                          <pic:cNvPr id="0" name="BM logo.jpg"/>
+                          <pic:cNvPicPr/>
+                        </pic:nvPicPr>
+                        <pic:blipFill>
+                          <a:blip r:embed="rId9"/>
+                          <a:stretch>
+                            <a:fillRect/>
+                          </a:stretch>
+                        </pic:blipFill>
+                        <pic:spPr>
+                          <a:xfrm>
+                            <a:off x="0" y="0"/>
+                            <a:ext cx="1376275" cy="914400"/>
+                          </a:xfrm>
+                          <a:prstGeom prst="rect"/>
+                        </pic:spPr>
+                      </pic:pic>
+                    </a:graphicData>
+                  </a:graphic>
+                </wp:inline>
+              </w:drawing>
             </w:r>
           </w:p>
         </w:tc>
@@ -133,7 +107,7 @@
         <w:rPr>
           <w:b/>
           <w:i w:val="0"/>
-          <w:sz w:val="26"/>
+          <w:sz w:val="22"/>
         </w:rPr>
         <w:t>STANDARD OPERATING PROCEDURE</w:t>
       </w:r>
@@ -148,7 +122,7 @@
           <w:i w:val="0"/>
           <w:sz w:val="30"/>
         </w:rPr>
-        <w:t>Tr3  |  Statement of Intent (BMorg)</w:t>
+        <w:t>Statement of Intent (BMorg)</w:t>
       </w:r>
     </w:p>
     <w:p/>
@@ -165,9 +139,6 @@
         <w:gridCol w:w="2340"/>
       </w:tblGrid>
       <w:tr>
-        <w:trPr>
-          <w:trHeight w:val="360"/>
-        </w:trPr>
         <w:tc>
           <w:tcPr>
             <w:tcW w:type="dxa" w:w="2340"/>
@@ -217,45 +188,6 @@
                 <w:i w:val="0"/>
                 <w:sz w:val="18"/>
               </w:rPr>
-              <w:t>Division</w:t>
-            </w:r>
-          </w:p>
-        </w:tc>
-        <w:tc>
-          <w:tcPr>
-            <w:tcW w:type="dxa" w:w="2340"/>
-          </w:tcPr>
-          <w:p>
-            <w:r>
-              <w:rPr>
-                <w:b w:val="0"/>
-                <w:i w:val="0"/>
-                <w:sz w:val="18"/>
-              </w:rPr>
-              <w:t>Board</w:t>
-            </w:r>
-          </w:p>
-        </w:tc>
-      </w:tr>
-      <w:tr>
-        <w:trPr>
-          <w:trHeight w:val="360"/>
-        </w:trPr>
-        <w:tc>
-          <w:tcPr>
-            <w:tcW w:type="dxa" w:w="2340"/>
-            <w:shd w:val="clear" w:color="auto" w:fill="D9D9D9"/>
-          </w:tcPr>
-          <w:p>
-            <w:pPr>
-              <w:jc w:val="center"/>
-            </w:pPr>
-            <w:r>
-              <w:rPr>
-                <w:b/>
-                <w:i w:val="0"/>
-                <w:sz w:val="18"/>
-              </w:rPr>
               <w:t>Department</w:t>
             </w:r>
           </w:p>
@@ -275,45 +207,8 @@
             </w:r>
           </w:p>
         </w:tc>
-        <w:tc>
-          <w:tcPr>
-            <w:tcW w:type="dxa" w:w="2340"/>
-            <w:shd w:val="clear" w:color="auto" w:fill="D9D9D9"/>
-          </w:tcPr>
-          <w:p>
-            <w:pPr>
-              <w:jc w:val="center"/>
-            </w:pPr>
-            <w:r>
-              <w:rPr>
-                <w:b/>
-                <w:i w:val="0"/>
-                <w:sz w:val="18"/>
-              </w:rPr>
-              <w:t>Owner</w:t>
-            </w:r>
-          </w:p>
-        </w:tc>
-        <w:tc>
-          <w:tcPr>
-            <w:tcW w:type="dxa" w:w="2340"/>
-          </w:tcPr>
-          <w:p>
-            <w:r>
-              <w:rPr>
-                <w:b w:val="0"/>
-                <w:i w:val="0"/>
-                <w:sz w:val="18"/>
-              </w:rPr>
-              <w:t>Isabel Hoy</w:t>
-            </w:r>
-          </w:p>
-        </w:tc>
       </w:tr>
       <w:tr>
-        <w:trPr>
-          <w:trHeight w:val="360"/>
-        </w:trPr>
         <w:tc>
           <w:tcPr>
             <w:tcW w:type="dxa" w:w="2340"/>
@@ -942,11 +837,14 @@
       </w:r>
     </w:p>
     <w:p>
+      <w:pPr>
+        <w:pStyle w:val="ListNumber"/>
+      </w:pPr>
       <w:r>
         <w:rPr>
           <w:sz w:val="20"/>
         </w:rPr>
-        <w:t>10. Record the BMorg confirmation number in the Records Log (see Section 8)</w:t>
+        <w:t>Record the BMorg confirmation number in the Records Log (see Section 8)</w:t>
       </w:r>
     </w:p>
     <w:p>

</xml_diff>

<commit_message>
Rebuild Tr3 SOP: left-only header, NC logo, actual 2026 SOI submission data
Header is now NC logo left-aligned only. Removed Scope, Roles, and Info
to Gather sections. Added 2026 reference answers from actual BMorg
submission and BMorg confirmation text. Renumbered to 8 sections.

Co-Authored-By: Claude Sonnet 4.6 <noreply@anthropic.com>
</commit_message>
<xml_diff>
--- a/Standard Operating Procedures/Tr3 Statement of Intent.docx
+++ b/Standard Operating Procedures/Tr3 Statement of Intent.docx
@@ -2,95 +2,45 @@
 <file path=word/document.xml><?xml version="1.0" encoding="utf-8"?>
 <w:document xmlns:wpc="http://schemas.microsoft.com/office/word/2010/wordprocessingCanvas" xmlns:mo="http://schemas.microsoft.com/office/mac/office/2008/main" xmlns:mc="http://schemas.openxmlformats.org/markup-compatibility/2006" xmlns:mv="urn:schemas-microsoft-com:mac:vml" xmlns:o="urn:schemas-microsoft-com:office:office" xmlns:r="http://schemas.openxmlformats.org/officeDocument/2006/relationships" xmlns:m="http://schemas.openxmlformats.org/officeDocument/2006/math" xmlns:v="urn:schemas-microsoft-com:vml" xmlns:wp14="http://schemas.microsoft.com/office/word/2010/wordprocessingDrawing" xmlns:wp="http://schemas.openxmlformats.org/drawingml/2006/wordprocessingDrawing" xmlns:w10="urn:schemas-microsoft-com:office:word" xmlns:w="http://schemas.openxmlformats.org/wordprocessingml/2006/main" xmlns:w14="http://schemas.microsoft.com/office/word/2010/wordml" xmlns:wpg="http://schemas.microsoft.com/office/word/2010/wordprocessingGroup" xmlns:wpi="http://schemas.microsoft.com/office/word/2010/wordprocessingInk" xmlns:wne="http://schemas.microsoft.com/office/word/2006/wordml" xmlns:wps="http://schemas.microsoft.com/office/word/2010/wordprocessingShape" mc:Ignorable="w14 wp14">
   <w:body>
-    <w:tbl>
-      <w:tblPr>
-        <w:tblW w:type="auto" w:w="0"/>
-        <w:jc w:val="center"/>
-        <w:tblLook w:firstColumn="1" w:firstRow="1" w:lastColumn="0" w:lastRow="0" w:noHBand="0" w:noVBand="1" w:val="04A0"/>
-      </w:tblPr>
-      <w:tblGrid>
-        <w:gridCol w:w="4680"/>
-        <w:gridCol w:w="4680"/>
-      </w:tblGrid>
-      <w:tr>
-        <w:tc>
-          <w:tcPr>
-            <w:tcW w:type="dxa" w:w="4680"/>
-            <w:vAlign w:val="center"/>
-            <w:tcBorders>
-              <w:top w:val="none"/>
-              <w:left w:val="none"/>
-              <w:bottom w:val="none"/>
-              <w:right w:val="none"/>
-            </w:tcBorders>
-          </w:tcPr>
-          <w:p>
-            <w:pPr>
-              <w:jc w:val="left"/>
-            </w:pPr>
-            <w:r>
-              <w:rPr>
-                <w:b/>
-                <w:i w:val="0"/>
-                <w:sz w:val="28"/>
-              </w:rPr>
-              <w:t>NIPPLE CRIME</w:t>
-            </w:r>
-          </w:p>
-        </w:tc>
-        <w:tc>
-          <w:tcPr>
-            <w:tcW w:type="dxa" w:w="4680"/>
-            <w:vAlign w:val="center"/>
-            <w:tcBorders>
-              <w:top w:val="none"/>
-              <w:left w:val="none"/>
-              <w:bottom w:val="none"/>
-              <w:right w:val="none"/>
-            </w:tcBorders>
-          </w:tcPr>
-          <w:p>
-            <w:pPr>
-              <w:jc w:val="right"/>
-            </w:pPr>
-            <w:r>
-              <w:drawing>
-                <wp:inline xmlns:a="http://schemas.openxmlformats.org/drawingml/2006/main" xmlns:pic="http://schemas.openxmlformats.org/drawingml/2006/picture">
-                  <wp:extent cx="1376275" cy="914400"/>
-                  <wp:docPr id="1" name="Picture 1"/>
-                  <wp:cNvGraphicFramePr>
-                    <a:graphicFrameLocks noChangeAspect="1"/>
-                  </wp:cNvGraphicFramePr>
-                  <a:graphic>
-                    <a:graphicData uri="http://schemas.openxmlformats.org/drawingml/2006/picture">
-                      <pic:pic>
-                        <pic:nvPicPr>
-                          <pic:cNvPr id="0" name="BM logo.jpg"/>
-                          <pic:cNvPicPr/>
-                        </pic:nvPicPr>
-                        <pic:blipFill>
-                          <a:blip r:embed="rId9"/>
-                          <a:stretch>
-                            <a:fillRect/>
-                          </a:stretch>
-                        </pic:blipFill>
-                        <pic:spPr>
-                          <a:xfrm>
-                            <a:off x="0" y="0"/>
-                            <a:ext cx="1376275" cy="914400"/>
-                          </a:xfrm>
-                          <a:prstGeom prst="rect"/>
-                        </pic:spPr>
-                      </pic:pic>
-                    </a:graphicData>
-                  </a:graphic>
-                </wp:inline>
-              </w:drawing>
-            </w:r>
-          </w:p>
-        </w:tc>
-      </w:tr>
-    </w:tbl>
+    <w:p>
+      <w:pPr>
+        <w:jc w:val="left"/>
+      </w:pPr>
+      <w:r>
+        <w:drawing>
+          <wp:inline xmlns:a="http://schemas.openxmlformats.org/drawingml/2006/main" xmlns:pic="http://schemas.openxmlformats.org/drawingml/2006/picture">
+            <wp:extent cx="3199845" cy="914400"/>
+            <wp:docPr id="1" name="Picture 1"/>
+            <wp:cNvGraphicFramePr>
+              <a:graphicFrameLocks noChangeAspect="1"/>
+            </wp:cNvGraphicFramePr>
+            <a:graphic>
+              <a:graphicData uri="http://schemas.openxmlformats.org/drawingml/2006/picture">
+                <pic:pic>
+                  <pic:nvPicPr>
+                    <pic:cNvPr id="0" name="NC logo.png"/>
+                    <pic:cNvPicPr/>
+                  </pic:nvPicPr>
+                  <pic:blipFill>
+                    <a:blip r:embed="rId9"/>
+                    <a:stretch>
+                      <a:fillRect/>
+                    </a:stretch>
+                  </pic:blipFill>
+                  <pic:spPr>
+                    <a:xfrm>
+                      <a:off x="0" y="0"/>
+                      <a:ext cx="3199845" cy="914400"/>
+                    </a:xfrm>
+                    <a:prstGeom prst="rect"/>
+                  </pic:spPr>
+                </pic:pic>
+              </a:graphicData>
+            </a:graphic>
+          </wp:inline>
+        </w:drawing>
+      </w:r>
+    </w:p>
     <w:p/>
     <w:p>
       <w:pPr>
@@ -319,7 +269,7 @@
         <w:rPr>
           <w:sz w:val="20"/>
         </w:rPr>
-        <w:t>This SOP documents the annual process for completing and submitting Nipple Crime's Statement of Intent (SOI) to the Burning Man Organization (BMorg). The SOI is the formal application required for theme camp registration and playa placement. Submission is managed by the Treasurer in coordination with the President and VP.</w:t>
+        <w:t>This SOP documents the annual process for completing and submitting Nipple Crime's Statement of Intent (SOI) to the Burning Man Organization (BMorg). The SOI is the formal application required for theme camp registration and playa placement. Submission is managed by the Treasurer in coordination with the President.</w:t>
       </w:r>
     </w:p>
     <w:p>
@@ -331,35 +281,7 @@
           <w:color w:val="000000"/>
           <w:sz w:val="26"/>
         </w:rPr>
-        <w:t>2. Scope</w:t>
-      </w:r>
-    </w:p>
-    <w:p>
-      <w:r>
-        <w:rPr>
-          <w:sz w:val="20"/>
-        </w:rPr>
-        <w:t>Applies to: Treasurer, President, VP, Infrastructure Director, Committees Director, HR Officer.</w:t>
-      </w:r>
-    </w:p>
-    <w:p>
-      <w:r>
-        <w:rPr>
-          <w:sz w:val="20"/>
-        </w:rPr>
-        <w:t>Frequency: Annually (each Burn cycle).</w:t>
-      </w:r>
-    </w:p>
-    <w:p>
-      <w:pPr>
-        <w:pStyle w:val="Heading1"/>
-      </w:pPr>
-      <w:r>
-        <w:rPr>
-          <w:color w:val="000000"/>
-          <w:sz w:val="26"/>
-        </w:rPr>
-        <w:t>3. Timeline</w:t>
+        <w:t>2. Timeline</w:t>
       </w:r>
     </w:p>
     <w:p>
@@ -381,17 +303,6 @@
         <w:rPr>
           <w:sz w:val="20"/>
         </w:rPr>
-        <w:t>Internal info-gathering deadline: 2 weeks before portal opens</w:t>
-      </w:r>
-    </w:p>
-    <w:p>
-      <w:pPr>
-        <w:pStyle w:val="ListBullet"/>
-      </w:pPr>
-      <w:r>
-        <w:rPr>
-          <w:sz w:val="20"/>
-        </w:rPr>
         <w:t>SOI submission deadline: February – March (verify annually)</w:t>
       </w:r>
     </w:p>
@@ -403,7 +314,29 @@
         <w:rPr>
           <w:sz w:val="20"/>
         </w:rPr>
-        <w:t>Placement decision announced: April – May</w:t>
+        <w:t>Steward Sale ticket allocations announced: second week of February</w:t>
+      </w:r>
+    </w:p>
+    <w:p>
+      <w:pPr>
+        <w:pStyle w:val="ListBullet"/>
+      </w:pPr>
+      <w:r>
+        <w:rPr>
+          <w:sz w:val="20"/>
+        </w:rPr>
+        <w:t>Conditional Late Season Directed tickets (new camps) announced: late spring</w:t>
+      </w:r>
+    </w:p>
+    <w:p>
+      <w:pPr>
+        <w:pStyle w:val="ListBullet"/>
+      </w:pPr>
+      <w:r>
+        <w:rPr>
+          <w:sz w:val="20"/>
+        </w:rPr>
+        <w:t>Placement decisions announced: April – May</w:t>
       </w:r>
     </w:p>
     <w:p>
@@ -426,73 +359,103 @@
           <w:color w:val="000000"/>
           <w:sz w:val="26"/>
         </w:rPr>
-        <w:t>4. Roles &amp; Responsibilities</w:t>
+        <w:t>3. Submission Steps</w:t>
       </w:r>
     </w:p>
     <w:p>
       <w:pPr>
-        <w:pStyle w:val="ListBullet"/>
+        <w:pStyle w:val="ListNumber"/>
       </w:pPr>
       <w:r>
         <w:rPr>
           <w:sz w:val="20"/>
         </w:rPr>
-        <w:t>Treasurer: Owns submission process; coordinates data gathering; maintains records</w:t>
+        <w:t>Go to burningman.org &gt; Participate &gt; Theme Camps &gt; Statement of Intent</w:t>
       </w:r>
     </w:p>
     <w:p>
       <w:pPr>
-        <w:pStyle w:val="ListBullet"/>
+        <w:pStyle w:val="ListNumber"/>
       </w:pPr>
       <w:r>
         <w:rPr>
           <w:sz w:val="20"/>
         </w:rPr>
-        <w:t>President: Reviews and approves SOI before submission</w:t>
+        <w:t>Log in using the Nipple Crime camp account (credentials held by President and Treasurer)</w:t>
       </w:r>
     </w:p>
     <w:p>
       <w:pPr>
-        <w:pStyle w:val="ListBullet"/>
+        <w:pStyle w:val="ListNumber"/>
       </w:pPr>
       <w:r>
         <w:rPr>
           <w:sz w:val="20"/>
         </w:rPr>
-        <w:t>VP: Provides camp overview and strategic goals</w:t>
+        <w:t>Select 'Update Returning Camp' (Nipple Crime is a returning placed camp)</w:t>
       </w:r>
     </w:p>
     <w:p>
       <w:pPr>
-        <w:pStyle w:val="ListBullet"/>
+        <w:pStyle w:val="ListNumber"/>
       </w:pPr>
       <w:r>
         <w:rPr>
           <w:sz w:val="20"/>
         </w:rPr>
-        <w:t>Infrastructure Director: Provides power, vehicle, and physical infrastructure data</w:t>
+        <w:t>Complete all required fields — see Section 4 for 2026 reference answers</w:t>
       </w:r>
     </w:p>
     <w:p>
       <w:pPr>
-        <w:pStyle w:val="ListBullet"/>
+        <w:pStyle w:val="ListNumber"/>
       </w:pPr>
       <w:r>
         <w:rPr>
           <w:sz w:val="20"/>
         </w:rPr>
-        <w:t>Committees Director: Provides list of interactive activities and public offerings</w:t>
+        <w:t>Review all entries with President before submitting</w:t>
       </w:r>
     </w:p>
     <w:p>
       <w:pPr>
-        <w:pStyle w:val="ListBullet"/>
+        <w:pStyle w:val="ListNumber"/>
       </w:pPr>
       <w:r>
         <w:rPr>
           <w:sz w:val="20"/>
         </w:rPr>
-        <w:t>HR Officer: Provides confirmed participant count</w:t>
+        <w:t>Submit form</w:t>
+      </w:r>
+    </w:p>
+    <w:p>
+      <w:pPr>
+        <w:pStyle w:val="ListNumber"/>
+      </w:pPr>
+      <w:r>
+        <w:rPr>
+          <w:sz w:val="20"/>
+        </w:rPr>
+        <w:t>Save / screenshot the BMorg confirmation email for records (see Section 5)</w:t>
+      </w:r>
+    </w:p>
+    <w:p>
+      <w:pPr>
+        <w:pStyle w:val="ListNumber"/>
+      </w:pPr>
+      <w:r>
+        <w:rPr>
+          <w:sz w:val="20"/>
+        </w:rPr>
+        <w:t>If updates are needed after submission, email placement@burningman.org with subject line:</w:t>
+      </w:r>
+    </w:p>
+    <w:p>
+      <w:r>
+        <w:rPr>
+          <w:sz w:val="20"/>
+        </w:rPr>
+        <w:t xml:space="preserve">   [Last Sector] Camp Name - SOI Updates   (example: [3:00] Nipple Crime - SOI Updates)</w:t>
       </w:r>
     </w:p>
     <w:p>
@@ -504,7 +467,7 @@
           <w:color w:val="000000"/>
           <w:sz w:val="26"/>
         </w:rPr>
-        <w:t>5. Information to Gather</w:t>
+        <w:t>4. 2026 Submission Reference</w:t>
       </w:r>
     </w:p>
     <w:p>
@@ -512,7 +475,7 @@
         <w:rPr>
           <w:sz w:val="20"/>
         </w:rPr>
-        <w:t>The Treasurer sends a request to all parties (see Section 4) no later than 2 weeks before portal opens.</w:t>
+        <w:t>The following answers were submitted for the 2026 Burn cycle. Update each year as needed.</w:t>
       </w:r>
     </w:p>
     <w:p/>
@@ -521,7 +484,7 @@
         <w:rPr>
           <w:sz w:val="20"/>
         </w:rPr>
-        <w:t>Camp Identity (from President / VP):</w:t>
+        <w:t>CAMP CONTACT</w:t>
       </w:r>
     </w:p>
     <w:p>
@@ -532,7 +495,7 @@
         <w:rPr>
           <w:sz w:val="20"/>
         </w:rPr>
-        <w:t>Official camp name</w:t>
+        <w:t>First Name: Reece</w:t>
       </w:r>
     </w:p>
     <w:p>
@@ -543,7 +506,7 @@
         <w:rPr>
           <w:sz w:val="20"/>
         </w:rPr>
-        <w:t>Camp theme and description (public-facing, ~2–3 sentences)</w:t>
+        <w:t>Last Name: Dassinger</w:t>
       </w:r>
     </w:p>
     <w:p>
@@ -554,16 +517,7 @@
         <w:rPr>
           <w:sz w:val="20"/>
         </w:rPr>
-        <w:t>Year established / returning camp status</w:t>
-      </w:r>
-    </w:p>
-    <w:p/>
-    <w:p>
-      <w:r>
-        <w:rPr>
-          <w:sz w:val="20"/>
-        </w:rPr>
-        <w:t>Participation (from HR Officer):</w:t>
+        <w:t>Email: reece@nipplecrime.org</w:t>
       </w:r>
     </w:p>
     <w:p>
@@ -574,7 +528,7 @@
         <w:rPr>
           <w:sz w:val="20"/>
         </w:rPr>
-        <w:t>Total confirmed camp members</w:t>
+        <w:t>Playa Name: Kirkland Cowboy</w:t>
       </w:r>
     </w:p>
     <w:p>
@@ -585,7 +539,7 @@
         <w:rPr>
           <w:sz w:val="20"/>
         </w:rPr>
-        <w:t>Estimated vehicle count</w:t>
+        <w:t>Phone: 775 247 4493</w:t>
       </w:r>
     </w:p>
     <w:p>
@@ -596,7 +550,7 @@
         <w:rPr>
           <w:sz w:val="20"/>
         </w:rPr>
-        <w:t>Number of structures / shade structures</w:t>
+        <w:t>Address: 5592 Spandrell Cir, Sparks, NV 89436</w:t>
       </w:r>
     </w:p>
     <w:p/>
@@ -605,7 +559,7 @@
         <w:rPr>
           <w:sz w:val="20"/>
         </w:rPr>
-        <w:t>Interactive Activities (from Committees Director):</w:t>
+        <w:t>BURNING MAN HISTORY</w:t>
       </w:r>
     </w:p>
     <w:p>
@@ -616,7 +570,7 @@
         <w:rPr>
           <w:sz w:val="20"/>
         </w:rPr>
-        <w:t>List of all public-facing activities and events</w:t>
+        <w:t>Years attended: 2014–2024</w:t>
       </w:r>
     </w:p>
     <w:p>
@@ -627,16 +581,7 @@
         <w:rPr>
           <w:sz w:val="20"/>
         </w:rPr>
-        <w:t>Any art installations or performances</w:t>
-      </w:r>
-    </w:p>
-    <w:p/>
-    <w:p>
-      <w:r>
-        <w:rPr>
-          <w:sz w:val="20"/>
-        </w:rPr>
-        <w:t>Infrastructure (from Infrastructure Director):</w:t>
+        <w:t>Projects &amp; Affiliations: Theme Camp, Mutant Vehicle, Art Installation</w:t>
       </w:r>
     </w:p>
     <w:p>
@@ -647,7 +592,16 @@
         <w:rPr>
           <w:sz w:val="20"/>
         </w:rPr>
-        <w:t>Total power requirement (kilowatts)</w:t>
+        <w:t>Description: 2014 participated in theme camp; 2015 built bar, designed/coordinated theme camp; 2016–2023 Nipple Crime camp lead; built art car 2023</w:t>
+      </w:r>
+    </w:p>
+    <w:p/>
+    <w:p>
+      <w:r>
+        <w:rPr>
+          <w:sz w:val="20"/>
+        </w:rPr>
+        <w:t>CAMP DETAILS</w:t>
       </w:r>
     </w:p>
     <w:p>
@@ -658,7 +612,7 @@
         <w:rPr>
           <w:sz w:val="20"/>
         </w:rPr>
-        <w:t>Generator count and capacity</w:t>
+        <w:t>Camp category: Theme Camp</w:t>
       </w:r>
     </w:p>
     <w:p>
@@ -669,7 +623,7 @@
         <w:rPr>
           <w:sz w:val="20"/>
         </w:rPr>
-        <w:t>Freshwater and greywater needs</w:t>
+        <w:t>Returning camp: Yes</w:t>
       </w:r>
     </w:p>
     <w:p>
@@ -680,7 +634,7 @@
         <w:rPr>
           <w:sz w:val="20"/>
         </w:rPr>
-        <w:t>Number and type of vehicles on playa</w:t>
+        <w:t>Camp name: Nipple Crime</w:t>
       </w:r>
     </w:p>
     <w:p>
@@ -691,16 +645,7 @@
         <w:rPr>
           <w:sz w:val="20"/>
         </w:rPr>
-        <w:t>Shade structure dimensions and type</w:t>
-      </w:r>
-    </w:p>
-    <w:p/>
-    <w:p>
-      <w:r>
-        <w:rPr>
-          <w:sz w:val="20"/>
-        </w:rPr>
-        <w:t>Financial / Nonprofit (Treasurer owned):</w:t>
+        <w:t>Last placed year: 2025</w:t>
       </w:r>
     </w:p>
     <w:p>
@@ -711,7 +656,16 @@
         <w:rPr>
           <w:sz w:val="20"/>
         </w:rPr>
-        <w:t>501(c)(3) / 509(a)(2) status confirmation</w:t>
+        <w:t>Will complete PCQ: Yes (existing placed camp)</w:t>
+      </w:r>
+    </w:p>
+    <w:p/>
+    <w:p>
+      <w:r>
+        <w:rPr>
+          <w:sz w:val="20"/>
+        </w:rPr>
+        <w:t>INTERACTIVITY</w:t>
       </w:r>
     </w:p>
     <w:p>
@@ -722,7 +676,142 @@
         <w:rPr>
           <w:sz w:val="20"/>
         </w:rPr>
-        <w:t>Dues and fee structure (for BMorg reference if requested)</w:t>
+        <w:t>Interactivity change: Reduced Interactivity</w:t>
+      </w:r>
+    </w:p>
+    <w:p>
+      <w:pPr>
+        <w:pStyle w:val="ListBullet"/>
+      </w:pPr>
+      <w:r>
+        <w:rPr>
+          <w:sz w:val="20"/>
+        </w:rPr>
+        <w:t>Description: Reducing one or two larger events; more open bar and fire poof time to reduce workload</w:t>
+      </w:r>
+    </w:p>
+    <w:p>
+      <w:pPr>
+        <w:pStyle w:val="ListBullet"/>
+      </w:pPr>
+      <w:r>
+        <w:rPr>
+          <w:sz w:val="20"/>
+        </w:rPr>
+        <w:t>Center Camp Activation: No</w:t>
+      </w:r>
+    </w:p>
+    <w:p/>
+    <w:p>
+      <w:r>
+        <w:rPr>
+          <w:sz w:val="20"/>
+        </w:rPr>
+        <w:t>MUTANT VEHICLES</w:t>
+      </w:r>
+    </w:p>
+    <w:p>
+      <w:pPr>
+        <w:pStyle w:val="ListBullet"/>
+      </w:pPr>
+      <w:r>
+        <w:rPr>
+          <w:sz w:val="20"/>
+        </w:rPr>
+        <w:t>Hosting MVs: Yes</w:t>
+      </w:r>
+    </w:p>
+    <w:p>
+      <w:pPr>
+        <w:pStyle w:val="ListBullet"/>
+      </w:pPr>
+      <w:r>
+        <w:rPr>
+          <w:sz w:val="20"/>
+        </w:rPr>
+        <w:t>MV Details: Great Sax, SirKiss, Green Zebra</w:t>
+      </w:r>
+    </w:p>
+    <w:p/>
+    <w:p>
+      <w:r>
+        <w:rPr>
+          <w:sz w:val="20"/>
+        </w:rPr>
+        <w:t>POPULATION</w:t>
+      </w:r>
+    </w:p>
+    <w:p>
+      <w:pPr>
+        <w:pStyle w:val="ListBullet"/>
+      </w:pPr>
+      <w:r>
+        <w:rPr>
+          <w:sz w:val="20"/>
+        </w:rPr>
+        <w:t>Number of campmates: 105</w:t>
+      </w:r>
+    </w:p>
+    <w:p>
+      <w:pPr>
+        <w:pStyle w:val="ListBullet"/>
+      </w:pPr>
+      <w:r>
+        <w:rPr>
+          <w:sz w:val="20"/>
+        </w:rPr>
+        <w:t>Population change: About the same</w:t>
+      </w:r>
+    </w:p>
+    <w:p/>
+    <w:p>
+      <w:r>
+        <w:rPr>
+          <w:sz w:val="20"/>
+        </w:rPr>
+        <w:t>TICKETS</w:t>
+      </w:r>
+    </w:p>
+    <w:p>
+      <w:pPr>
+        <w:pStyle w:val="ListBullet"/>
+      </w:pPr>
+      <w:r>
+        <w:rPr>
+          <w:sz w:val="20"/>
+        </w:rPr>
+        <w:t>Number of Steward Sale tickets requested: 44</w:t>
+      </w:r>
+    </w:p>
+    <w:p/>
+    <w:p>
+      <w:r>
+        <w:rPr>
+          <w:sz w:val="20"/>
+        </w:rPr>
+        <w:t>ADDITIONAL CONTACTS</w:t>
+      </w:r>
+    </w:p>
+    <w:p>
+      <w:pPr>
+        <w:pStyle w:val="ListBullet"/>
+      </w:pPr>
+      <w:r>
+        <w:rPr>
+          <w:sz w:val="20"/>
+        </w:rPr>
+        <w:t>Additional Contact: Isabel Hoy — izhoy@yahoo.com</w:t>
+      </w:r>
+    </w:p>
+    <w:p>
+      <w:pPr>
+        <w:pStyle w:val="ListBullet"/>
+      </w:pPr>
+      <w:r>
+        <w:rPr>
+          <w:sz w:val="20"/>
+        </w:rPr>
+        <w:t>Sustainability Contact: Chris Reddin — creddin1@hotmail.com</w:t>
       </w:r>
     </w:p>
     <w:p>
@@ -734,117 +823,51 @@
           <w:color w:val="000000"/>
           <w:sz w:val="26"/>
         </w:rPr>
-        <w:t>6. Submission Steps</w:t>
+        <w:t>5. BMorg Confirmation (2026)</w:t>
       </w:r>
     </w:p>
     <w:p>
-      <w:pPr>
-        <w:pStyle w:val="ListNumber"/>
-      </w:pPr>
       <w:r>
         <w:rPr>
           <w:sz w:val="20"/>
         </w:rPr>
-        <w:t>Navigate to the BMorg Theme Camp SOI portal (burningman.org &gt; Theme Camps &gt; Registration)</w:t>
+        <w:t>Upon successful submission BMorg sends the following confirmation:</w:t>
       </w:r>
     </w:p>
+    <w:p/>
     <w:p>
-      <w:pPr>
-        <w:pStyle w:val="ListNumber"/>
-      </w:pPr>
       <w:r>
         <w:rPr>
           <w:sz w:val="20"/>
         </w:rPr>
-        <w:t>Log in with the Nipple Crime camp account (credentials held by Treasurer and President)</w:t>
+        <w:t>"Thank you for submitting The Theme Camp Statement of Intent. We'll be reviewing these in the upcoming weeks and will reach out if we have any questions or need clarification. Stewards Sale allocations will be announced by the second week of February. Conditional Late Season Directed tickets for new theme camps will be announced in the late spring."</w:t>
       </w:r>
     </w:p>
+    <w:p/>
     <w:p>
-      <w:pPr>
-        <w:pStyle w:val="ListNumber"/>
-      </w:pPr>
       <w:r>
         <w:rPr>
           <w:sz w:val="20"/>
         </w:rPr>
-        <w:t>Select 'Start New Statement of Intent' or 'Update Returning Camp'</w:t>
+        <w:t>"If you are a theme camp in good standing and are taking 2026 off, we will note that for future access. Please plan to complete a SOI when you return!"</w:t>
       </w:r>
     </w:p>
+    <w:p/>
     <w:p>
-      <w:pPr>
-        <w:pStyle w:val="ListNumber"/>
-      </w:pPr>
       <w:r>
         <w:rPr>
           <w:sz w:val="20"/>
         </w:rPr>
-        <w:t>Complete all required fields using the information gathered in Section 5</w:t>
+        <w:t>"If you have updates after submitting, please email placement@burningman.org with the last sector your camp was placed in, camp name, and 'SOI Updates' in the subject line. Example: [3:00] Camp Buttercup - SOI Updates."</w:t>
       </w:r>
     </w:p>
+    <w:p/>
     <w:p>
-      <w:pPr>
-        <w:pStyle w:val="ListNumber"/>
-      </w:pPr>
       <w:r>
         <w:rPr>
           <w:sz w:val="20"/>
         </w:rPr>
-        <w:t>In the 'Camp Description' field, use the approved language from the President</w:t>
-      </w:r>
-    </w:p>
-    <w:p>
-      <w:pPr>
-        <w:pStyle w:val="ListNumber"/>
-      </w:pPr>
-      <w:r>
-        <w:rPr>
-          <w:sz w:val="20"/>
-        </w:rPr>
-        <w:t>Review all entries for accuracy</w:t>
-      </w:r>
-    </w:p>
-    <w:p>
-      <w:pPr>
-        <w:pStyle w:val="ListNumber"/>
-      </w:pPr>
-      <w:r>
-        <w:rPr>
-          <w:sz w:val="20"/>
-        </w:rPr>
-        <w:t>Share draft with President and VP for approval (minimum 48 hours before deadline)</w:t>
-      </w:r>
-    </w:p>
-    <w:p>
-      <w:pPr>
-        <w:pStyle w:val="ListNumber"/>
-      </w:pPr>
-      <w:r>
-        <w:rPr>
-          <w:sz w:val="20"/>
-        </w:rPr>
-        <w:t>Incorporate any revisions</w:t>
-      </w:r>
-    </w:p>
-    <w:p>
-      <w:pPr>
-        <w:pStyle w:val="ListNumber"/>
-      </w:pPr>
-      <w:r>
-        <w:rPr>
-          <w:sz w:val="20"/>
-        </w:rPr>
-        <w:t>Submit and immediately save / screenshot the confirmation page</w:t>
-      </w:r>
-    </w:p>
-    <w:p>
-      <w:pPr>
-        <w:pStyle w:val="ListNumber"/>
-      </w:pPr>
-      <w:r>
-        <w:rPr>
-          <w:sz w:val="20"/>
-        </w:rPr>
-        <w:t>Record the BMorg confirmation number in the Records Log (see Section 8)</w:t>
+        <w:t>Save this confirmation email to: [Shared Drive &gt; Treasurer &gt; BMorg &gt; SOI &gt; YYYY]</w:t>
       </w:r>
     </w:p>
     <w:p>
@@ -856,7 +879,7 @@
           <w:color w:val="000000"/>
           <w:sz w:val="26"/>
         </w:rPr>
-        <w:t>7. Post-Submission</w:t>
+        <w:t>6. Record Keeping</w:t>
       </w:r>
     </w:p>
     <w:p>
@@ -867,74 +890,7 @@
         <w:rPr>
           <w:sz w:val="20"/>
         </w:rPr>
-        <w:t>Monitor the Nipple Crime email inbox for BMorg follow-up requests</w:t>
-      </w:r>
-    </w:p>
-    <w:p>
-      <w:pPr>
-        <w:pStyle w:val="ListBullet"/>
-      </w:pPr>
-      <w:r>
-        <w:rPr>
-          <w:sz w:val="20"/>
-        </w:rPr>
-        <w:t>Respond to any BMorg questions within 48 hours</w:t>
-      </w:r>
-    </w:p>
-    <w:p>
-      <w:pPr>
-        <w:pStyle w:val="ListBullet"/>
-      </w:pPr>
-      <w:r>
-        <w:rPr>
-          <w:sz w:val="20"/>
-        </w:rPr>
-        <w:t>Notify the full Board when placement decision is received</w:t>
-      </w:r>
-    </w:p>
-    <w:p>
-      <w:pPr>
-        <w:pStyle w:val="ListBullet"/>
-      </w:pPr>
-      <w:r>
-        <w:rPr>
-          <w:sz w:val="20"/>
-        </w:rPr>
-        <w:t>If waitlisted: follow BMorg waitlist instructions and notify Board immediately</w:t>
-      </w:r>
-    </w:p>
-    <w:p>
-      <w:pPr>
-        <w:pStyle w:val="ListBullet"/>
-      </w:pPr>
-      <w:r>
-        <w:rPr>
-          <w:sz w:val="20"/>
-        </w:rPr>
-        <w:t>If denied: convene Board discussion within 1 week to determine next steps</w:t>
-      </w:r>
-    </w:p>
-    <w:p>
-      <w:pPr>
-        <w:pStyle w:val="Heading1"/>
-      </w:pPr>
-      <w:r>
-        <w:rPr>
-          <w:color w:val="000000"/>
-          <w:sz w:val="26"/>
-        </w:rPr>
-        <w:t>8. Record Keeping</w:t>
-      </w:r>
-    </w:p>
-    <w:p>
-      <w:pPr>
-        <w:pStyle w:val="ListBullet"/>
-      </w:pPr>
-      <w:r>
-        <w:rPr>
-          <w:sz w:val="20"/>
-        </w:rPr>
-        <w:t>Save submitted SOI as PDF (screenshot confirmation page if PDF not available)</w:t>
+        <w:t>Save submitted SOI confirmation email as PDF</w:t>
       </w:r>
     </w:p>
     <w:p>
@@ -956,15 +912,7 @@
         <w:rPr>
           <w:sz w:val="20"/>
         </w:rPr>
-        <w:t>Log entry in the BMorg Records Log:</w:t>
-      </w:r>
-    </w:p>
-    <w:p>
-      <w:r>
-        <w:rPr>
-          <w:sz w:val="20"/>
-        </w:rPr>
-        <w:t xml:space="preserve">    Submission date, confirmation number, submitted by, portal URL, placement result</w:t>
+        <w:t>Log: submission date, submitted by, any BMorg correspondence, placement result</w:t>
       </w:r>
     </w:p>
     <w:p>
@@ -987,7 +935,7 @@
           <w:color w:val="000000"/>
           <w:sz w:val="26"/>
         </w:rPr>
-        <w:t>9. Contacts</w:t>
+        <w:t>7. Contacts</w:t>
       </w:r>
     </w:p>
     <w:p>
@@ -998,7 +946,7 @@
         <w:rPr>
           <w:sz w:val="20"/>
         </w:rPr>
-        <w:t>BMorg Theme Camp Services: burningman.org (contact form under Theme Camps section)</w:t>
+        <w:t>BMorg Placement: placement@burningman.org</w:t>
       </w:r>
     </w:p>
     <w:p>
@@ -1009,7 +957,7 @@
         <w:rPr>
           <w:sz w:val="20"/>
         </w:rPr>
-        <w:t>President: Reece Dassinger</w:t>
+        <w:t>President / Primary Submitter: Reece Dassinger — reece@nipplecrime.org</w:t>
       </w:r>
     </w:p>
     <w:p>
@@ -1020,7 +968,7 @@
         <w:rPr>
           <w:sz w:val="20"/>
         </w:rPr>
-        <w:t>VP / SOP Owner: Chris Reddin</w:t>
+        <w:t>Treasurer: Isabel Hoy — izhoy@yahoo.com</w:t>
       </w:r>
     </w:p>
     <w:p>
@@ -1031,7 +979,7 @@
         <w:rPr>
           <w:sz w:val="20"/>
         </w:rPr>
-        <w:t>Treasurer / Process Owner: Isabel Hoy</w:t>
+        <w:t>VP / SOP Owner: Chris Reddin — creddin1@hotmail.com</w:t>
       </w:r>
     </w:p>
     <w:p>
@@ -1043,7 +991,7 @@
           <w:color w:val="000000"/>
           <w:sz w:val="26"/>
         </w:rPr>
-        <w:t>10. Revision History</w:t>
+        <w:t>8. Revision History</w:t>
       </w:r>
     </w:p>
     <w:p>

</xml_diff>